<commit_message>
Improve Word exam formatting: yellow highlights, justified text, line spacing
- Add highlight_yellow() helper for answer text
- Apply JUSTIFY alignment to all body passages
- Keep 大問1 English lines LEFT-aligned with indent
- Expand long-passage line spacing to 18pt (~1.5x)
- Renumber sections to match past exam structure
- Yellow highlight on all model answers throughout

https://claude.ai/code/session_015DW3MeoTGzyTVFtzJFvLng
</commit_message>
<xml_diff>
--- a/output/exam_comm2_2nd_mid.docx
+++ b/output/exam_comm2_2nd_mid.docx
@@ -60,6 +60,7 @@
       <w:pPr>
         <w:spacing w:before="60" w:after="0"/>
         <w:ind w:left="170" w:firstLine="0"/>
+        <w:jc w:val="both"/>
       </w:pPr>
       <w:r>
         <w:rPr>
@@ -99,7 +100,7 @@
           <w:sz w:val="21"/>
           <w:u w:val="none"/>
         </w:rPr>
-        <w:t xml:space="preserve">　　　　</w:t>
+        <w:tab/>
       </w:r>
       <w:r>
         <w:rPr>
@@ -108,6 +109,7 @@
           <w:i w:val="0"/>
           <w:sz w:val="21"/>
           <w:u w:val="none"/>
+          <w:highlight w:val="yellow"/>
         </w:rPr>
         <w:t>emits</w:t>
       </w:r>
@@ -116,6 +118,7 @@
       <w:pPr>
         <w:spacing w:before="0" w:after="80"/>
         <w:ind w:left="454" w:firstLine="0"/>
+        <w:jc w:val="left"/>
       </w:pPr>
       <w:r>
         <w:rPr>
@@ -132,6 +135,7 @@
       <w:pPr>
         <w:spacing w:before="60" w:after="0"/>
         <w:ind w:left="170" w:firstLine="0"/>
+        <w:jc w:val="both"/>
       </w:pPr>
       <w:r>
         <w:rPr>
@@ -171,7 +175,7 @@
           <w:sz w:val="21"/>
           <w:u w:val="none"/>
         </w:rPr>
-        <w:t xml:space="preserve">　　　　</w:t>
+        <w:tab/>
       </w:r>
       <w:r>
         <w:rPr>
@@ -180,6 +184,7 @@
           <w:i w:val="0"/>
           <w:sz w:val="21"/>
           <w:u w:val="none"/>
+          <w:highlight w:val="yellow"/>
         </w:rPr>
         <w:t>prevent / getting</w:t>
       </w:r>
@@ -188,6 +193,7 @@
       <w:pPr>
         <w:spacing w:before="0" w:after="80"/>
         <w:ind w:left="454" w:firstLine="0"/>
+        <w:jc w:val="left"/>
       </w:pPr>
       <w:r>
         <w:rPr>
@@ -204,6 +210,7 @@
       <w:pPr>
         <w:spacing w:before="60" w:after="0"/>
         <w:ind w:left="170" w:firstLine="0"/>
+        <w:jc w:val="both"/>
       </w:pPr>
       <w:r>
         <w:rPr>
@@ -243,7 +250,7 @@
           <w:sz w:val="21"/>
           <w:u w:val="none"/>
         </w:rPr>
-        <w:t xml:space="preserve">　　　　</w:t>
+        <w:tab/>
       </w:r>
       <w:r>
         <w:rPr>
@@ -252,6 +259,7 @@
           <w:i w:val="0"/>
           <w:sz w:val="21"/>
           <w:u w:val="none"/>
+          <w:highlight w:val="yellow"/>
         </w:rPr>
         <w:t>implemented</w:t>
       </w:r>
@@ -260,6 +268,7 @@
       <w:pPr>
         <w:spacing w:before="0" w:after="80"/>
         <w:ind w:left="454" w:firstLine="0"/>
+        <w:jc w:val="left"/>
       </w:pPr>
       <w:r>
         <w:rPr>
@@ -276,6 +285,7 @@
       <w:pPr>
         <w:spacing w:before="60" w:after="0"/>
         <w:ind w:left="170" w:firstLine="0"/>
+        <w:jc w:val="both"/>
       </w:pPr>
       <w:r>
         <w:rPr>
@@ -315,7 +325,7 @@
           <w:sz w:val="21"/>
           <w:u w:val="none"/>
         </w:rPr>
-        <w:t xml:space="preserve">　　　　</w:t>
+        <w:tab/>
       </w:r>
       <w:r>
         <w:rPr>
@@ -324,6 +334,7 @@
           <w:i w:val="0"/>
           <w:sz w:val="21"/>
           <w:u w:val="none"/>
+          <w:highlight w:val="yellow"/>
         </w:rPr>
         <w:t>maintain</w:t>
       </w:r>
@@ -332,6 +343,7 @@
       <w:pPr>
         <w:spacing w:before="0" w:after="80"/>
         <w:ind w:left="454" w:firstLine="0"/>
+        <w:jc w:val="left"/>
       </w:pPr>
       <w:r>
         <w:rPr>
@@ -348,6 +360,7 @@
       <w:pPr>
         <w:spacing w:before="60" w:after="0"/>
         <w:ind w:left="170" w:firstLine="0"/>
+        <w:jc w:val="both"/>
       </w:pPr>
       <w:r>
         <w:rPr>
@@ -387,7 +400,7 @@
           <w:sz w:val="21"/>
           <w:u w:val="none"/>
         </w:rPr>
-        <w:t xml:space="preserve">　　　　</w:t>
+        <w:tab/>
       </w:r>
       <w:r>
         <w:rPr>
@@ -396,6 +409,7 @@
           <w:i w:val="0"/>
           <w:sz w:val="21"/>
           <w:u w:val="none"/>
+          <w:highlight w:val="yellow"/>
         </w:rPr>
         <w:t>without sacrificing</w:t>
       </w:r>
@@ -404,6 +418,7 @@
       <w:pPr>
         <w:spacing w:before="0" w:after="80"/>
         <w:ind w:left="454" w:firstLine="0"/>
+        <w:jc w:val="left"/>
       </w:pPr>
       <w:r>
         <w:rPr>
@@ -420,6 +435,7 @@
       <w:pPr>
         <w:spacing w:before="60" w:after="0"/>
         <w:ind w:left="170" w:firstLine="0"/>
+        <w:jc w:val="both"/>
       </w:pPr>
       <w:r>
         <w:rPr>
@@ -459,7 +475,7 @@
           <w:sz w:val="21"/>
           <w:u w:val="none"/>
         </w:rPr>
-        <w:t xml:space="preserve">　　　　</w:t>
+        <w:tab/>
       </w:r>
       <w:r>
         <w:rPr>
@@ -468,6 +484,7 @@
           <w:i w:val="0"/>
           <w:sz w:val="21"/>
           <w:u w:val="none"/>
+          <w:highlight w:val="yellow"/>
         </w:rPr>
         <w:t>serves as</w:t>
       </w:r>
@@ -476,6 +493,7 @@
       <w:pPr>
         <w:spacing w:before="0" w:after="80"/>
         <w:ind w:left="454" w:firstLine="0"/>
+        <w:jc w:val="left"/>
       </w:pPr>
       <w:r>
         <w:rPr>
@@ -492,6 +510,7 @@
       <w:pPr>
         <w:spacing w:before="60" w:after="0"/>
         <w:ind w:left="170" w:firstLine="0"/>
+        <w:jc w:val="both"/>
       </w:pPr>
       <w:r>
         <w:rPr>
@@ -531,7 +550,7 @@
           <w:sz w:val="21"/>
           <w:u w:val="none"/>
         </w:rPr>
-        <w:t xml:space="preserve">　　　　</w:t>
+        <w:tab/>
       </w:r>
       <w:r>
         <w:rPr>
@@ -540,6 +559,7 @@
           <w:i w:val="0"/>
           <w:sz w:val="21"/>
           <w:u w:val="none"/>
+          <w:highlight w:val="yellow"/>
         </w:rPr>
         <w:t>led / revise</w:t>
       </w:r>
@@ -548,6 +568,7 @@
       <w:pPr>
         <w:spacing w:before="0" w:after="80"/>
         <w:ind w:left="454" w:firstLine="0"/>
+        <w:jc w:val="left"/>
       </w:pPr>
       <w:r>
         <w:rPr>
@@ -564,6 +585,7 @@
       <w:pPr>
         <w:spacing w:before="60" w:after="0"/>
         <w:ind w:left="170" w:firstLine="0"/>
+        <w:jc w:val="both"/>
       </w:pPr>
       <w:r>
         <w:rPr>
@@ -603,7 +625,7 @@
           <w:sz w:val="21"/>
           <w:u w:val="none"/>
         </w:rPr>
-        <w:t xml:space="preserve">　　　　</w:t>
+        <w:tab/>
       </w:r>
       <w:r>
         <w:rPr>
@@ -612,6 +634,7 @@
           <w:i w:val="0"/>
           <w:sz w:val="21"/>
           <w:u w:val="none"/>
+          <w:highlight w:val="yellow"/>
         </w:rPr>
         <w:t>prevents</w:t>
       </w:r>
@@ -620,6 +643,7 @@
       <w:pPr>
         <w:spacing w:before="0" w:after="80"/>
         <w:ind w:left="454" w:firstLine="0"/>
+        <w:jc w:val="left"/>
       </w:pPr>
       <w:r>
         <w:rPr>
@@ -636,6 +660,7 @@
       <w:pPr>
         <w:spacing w:before="60" w:after="0"/>
         <w:ind w:left="170" w:firstLine="0"/>
+        <w:jc w:val="both"/>
       </w:pPr>
       <w:r>
         <w:rPr>
@@ -675,7 +700,7 @@
           <w:sz w:val="21"/>
           <w:u w:val="none"/>
         </w:rPr>
-        <w:t xml:space="preserve">　　　　</w:t>
+        <w:tab/>
       </w:r>
       <w:r>
         <w:rPr>
@@ -684,6 +709,7 @@
           <w:i w:val="0"/>
           <w:sz w:val="21"/>
           <w:u w:val="none"/>
+          <w:highlight w:val="yellow"/>
         </w:rPr>
         <w:t>seek to</w:t>
       </w:r>
@@ -692,6 +718,7 @@
       <w:pPr>
         <w:spacing w:before="0" w:after="80"/>
         <w:ind w:left="454" w:firstLine="0"/>
+        <w:jc w:val="left"/>
       </w:pPr>
       <w:r>
         <w:rPr>
@@ -759,11 +786,12 @@
             <w:pPr>
               <w:spacing w:before="40" w:after="40"/>
               <w:ind w:left="0" w:firstLine="0"/>
+              <w:jc w:val="both"/>
             </w:pPr>
             <w:r>
               <w:rPr>
                 <w:rFonts w:eastAsia="MS Mincho" w:ascii="Times New Roman" w:hAnsi="Times New Roman"/>
-                <w:b w:val="0"/>
+                <w:b/>
                 <w:i w:val="0"/>
                 <w:sz w:val="21"/>
                 <w:u w:val="none"/>
@@ -785,11 +813,12 @@
             <w:pPr>
               <w:spacing w:before="0" w:after="0"/>
               <w:ind w:left="0" w:firstLine="0"/>
+              <w:jc w:val="both"/>
             </w:pPr>
             <w:r>
               <w:rPr>
                 <w:rFonts w:eastAsia="MS Mincho" w:ascii="Times New Roman" w:hAnsi="Times New Roman"/>
-                <w:b w:val="0"/>
+                <w:b/>
                 <w:i w:val="0"/>
                 <w:sz w:val="21"/>
                 <w:u w:val="none"/>
@@ -891,11 +920,12 @@
             <w:pPr>
               <w:spacing w:before="80" w:after="0"/>
               <w:ind w:left="0" w:firstLine="0"/>
+              <w:jc w:val="both"/>
             </w:pPr>
             <w:r>
               <w:rPr>
                 <w:rFonts w:eastAsia="MS Mincho" w:ascii="Times New Roman" w:hAnsi="Times New Roman"/>
-                <w:b w:val="0"/>
+                <w:b/>
                 <w:i w:val="0"/>
                 <w:sz w:val="21"/>
                 <w:u w:val="none"/>
@@ -917,11 +947,12 @@
             <w:pPr>
               <w:spacing w:before="0" w:after="40"/>
               <w:ind w:left="0" w:firstLine="0"/>
+              <w:jc w:val="both"/>
             </w:pPr>
             <w:r>
               <w:rPr>
                 <w:rFonts w:eastAsia="MS Mincho" w:ascii="Times New Roman" w:hAnsi="Times New Roman"/>
-                <w:b w:val="0"/>
+                <w:b/>
                 <w:i w:val="0"/>
                 <w:sz w:val="21"/>
                 <w:u w:val="none"/>
@@ -976,7 +1007,7 @@
           <w:sz w:val="21"/>
           <w:u w:val="none"/>
         </w:rPr>
-        <w:t xml:space="preserve">　（下線部は「この段落に適さない」の意）</w:t>
+        <w:t xml:space="preserve">　　　　</w:t>
       </w:r>
       <w:r>
         <w:rPr>
@@ -985,8 +1016,9 @@
           <w:i w:val="0"/>
           <w:sz w:val="21"/>
           <w:u w:val="none"/>
+          <w:highlight w:val="yellow"/>
         </w:rPr>
-        <w:t xml:space="preserve">　　③</w:t>
+        <w:t>③</w:t>
       </w:r>
     </w:p>
     <w:p>
@@ -1032,12 +1064,12 @@
           <w:sz w:val="21"/>
           <w:u w:val="none"/>
         </w:rPr>
-        <w:t xml:space="preserve"> even when they come at the beginning of a sentence.（下線部は「小文字ではじまっている」の意））</w:t>
+        <w:t xml:space="preserve"> even when they come at the beginning of a sentence.）</w:t>
       </w:r>
     </w:p>
     <w:p>
       <w:pPr>
-        <w:spacing w:before="0" w:after="80"/>
+        <w:spacing w:before="0" w:after="40"/>
         <w:ind w:left="283" w:firstLine="0"/>
       </w:pPr>
       <w:r>
@@ -1050,6 +1082,22 @@
         </w:rPr>
         <w:t>[ ア it's true that ／ イ in this way ／ ウ similarly ／ エ what's more ／ オ in short ]</w:t>
       </w:r>
+    </w:p>
+    <w:p>
+      <w:pPr>
+        <w:spacing w:before="40" w:after="80"/>
+        <w:ind w:left="1134" w:firstLine="0"/>
+      </w:pPr>
+      <w:r>
+        <w:rPr>
+          <w:rFonts w:eastAsia="MS Mincho" w:ascii="Times New Roman" w:hAnsi="Times New Roman"/>
+          <w:b w:val="0"/>
+          <w:i w:val="0"/>
+          <w:sz w:val="21"/>
+          <w:u w:val="none"/>
+        </w:rPr>
+        <w:t xml:space="preserve">A　</w:t>
+      </w:r>
       <w:r>
         <w:rPr>
           <w:rFonts w:eastAsia="MS Mincho" w:ascii="Times New Roman" w:hAnsi="Times New Roman"/>
@@ -1057,8 +1105,30 @@
           <w:i w:val="0"/>
           <w:sz w:val="21"/>
           <w:u w:val="none"/>
+          <w:highlight w:val="yellow"/>
         </w:rPr>
-        <w:t xml:space="preserve">　　　　A ア　B イ</w:t>
+        <w:t>ア</w:t>
+      </w:r>
+      <w:r>
+        <w:rPr>
+          <w:rFonts w:eastAsia="MS Mincho" w:ascii="Times New Roman" w:hAnsi="Times New Roman"/>
+          <w:b w:val="0"/>
+          <w:i w:val="0"/>
+          <w:sz w:val="21"/>
+          <w:u w:val="none"/>
+        </w:rPr>
+        <w:t xml:space="preserve">　　B　</w:t>
+      </w:r>
+      <w:r>
+        <w:rPr>
+          <w:rFonts w:eastAsia="MS Mincho" w:ascii="Times New Roman" w:hAnsi="Times New Roman"/>
+          <w:b/>
+          <w:i w:val="0"/>
+          <w:sz w:val="21"/>
+          <w:u w:val="none"/>
+          <w:highlight w:val="yellow"/>
+        </w:rPr>
+        <w:t>イ</w:t>
       </w:r>
     </w:p>
     <w:p>
@@ -1084,7 +1154,7 @@
           <w:sz w:val="21"/>
           <w:u w:val="none"/>
         </w:rPr>
-        <w:t xml:space="preserve">　Choose the best word for each blank from options ア to エ.  All the options are given in their base form（下線は「原形で書かれている」の意）.</w:t>
+        <w:t xml:space="preserve">　Choose the best word for each blank from options ア to エ.  All the options are given in their base form.</w:t>
       </w:r>
       <w:r>
         <w:rPr>
@@ -1100,7 +1170,8 @@
     <w:p>
       <w:pPr>
         <w:spacing w:before="40" w:after="40"/>
-        <w:ind w:left="283" w:firstLine="0"/>
+        <w:ind w:left="0" w:firstLine="0"/>
+        <w:jc w:val="center"/>
       </w:pPr>
       <w:r>
         <w:rPr>
@@ -1117,6 +1188,7 @@
       <w:pPr>
         <w:spacing w:before="40" w:after="40"/>
         <w:ind w:left="170" w:firstLine="170"/>
+        <w:jc w:val="both"/>
       </w:pPr>
       <w:r>
         <w:rPr>
@@ -1132,7 +1204,8 @@
     <w:p>
       <w:pPr>
         <w:spacing w:before="40" w:after="120"/>
-        <w:ind w:left="1134" w:firstLine="0"/>
+        <w:ind w:left="0" w:firstLine="0"/>
+        <w:jc w:val="center"/>
       </w:pPr>
       <w:r>
         <w:rPr>
@@ -1141,6 +1214,7 @@
           <w:i w:val="0"/>
           <w:sz w:val="21"/>
           <w:u w:val="none"/>
+          <w:highlight w:val="yellow"/>
         </w:rPr>
         <w:t>１ア　２ウ　３イ　４エ</w:t>
       </w:r>
@@ -1339,6 +1413,7 @@
       <w:pPr>
         <w:spacing w:before="40" w:after="0"/>
         <w:ind w:left="170" w:firstLine="170"/>
+        <w:jc w:val="both"/>
       </w:pPr>
       <w:r>
         <w:rPr>
@@ -1355,6 +1430,7 @@
       <w:pPr>
         <w:spacing w:before="0" w:after="80"/>
         <w:ind w:left="170" w:firstLine="170"/>
+        <w:jc w:val="both"/>
       </w:pPr>
       <w:r>
         <w:rPr>
@@ -1379,6 +1455,7 @@
           <w:i w:val="0"/>
           <w:sz w:val="19"/>
           <w:u w:val="none"/>
+          <w:highlight w:val="yellow"/>
         </w:rPr>
         <w:t>1.（planners）once（used）　　2.（systems）so that（they）　　3.（infrastructure）such as（the）　　4.（cycle）instead of（driving）　　5.（now）quicker（to）</w:t>
       </w:r>
@@ -1396,7 +1473,7 @@
           <w:sz w:val="22"/>
           <w:u w:val="none"/>
         </w:rPr>
-        <w:t>【３】</w:t>
+        <w:t>【５】</w:t>
       </w:r>
       <w:r>
         <w:rPr>
@@ -1451,7 +1528,7 @@
           <w:sz w:val="22"/>
           <w:u w:val="none"/>
         </w:rPr>
-        <w:t>【４】</w:t>
+        <w:t>【６】</w:t>
       </w:r>
       <w:r>
         <w:rPr>
@@ -1478,6 +1555,7 @@
       <w:pPr>
         <w:spacing w:before="40" w:after="40"/>
         <w:ind w:left="170" w:firstLine="170"/>
+        <w:jc w:val="both"/>
       </w:pPr>
       <w:r>
         <w:rPr>
@@ -1493,7 +1571,8 @@
     <w:p>
       <w:pPr>
         <w:spacing w:before="40" w:after="40"/>
-        <w:ind w:left="567" w:firstLine="0"/>
+        <w:ind w:left="0" w:firstLine="0"/>
+        <w:jc w:val="center"/>
       </w:pPr>
       <w:r>
         <w:rPr>
@@ -1509,7 +1588,8 @@
     <w:p>
       <w:pPr>
         <w:spacing w:before="40" w:after="120"/>
-        <w:ind w:left="1134" w:firstLine="0"/>
+        <w:ind w:left="0" w:firstLine="0"/>
+        <w:jc w:val="center"/>
       </w:pPr>
       <w:r>
         <w:rPr>
@@ -1518,6 +1598,7 @@
           <w:i w:val="0"/>
           <w:sz w:val="21"/>
           <w:u w:val="none"/>
+          <w:highlight w:val="yellow"/>
         </w:rPr>
         <w:t>１ウ　２ア　３エ　４オ　５イ</w:t>
       </w:r>
@@ -1535,7 +1616,7 @@
           <w:sz w:val="22"/>
           <w:u w:val="none"/>
         </w:rPr>
-        <w:t>【５】</w:t>
+        <w:t>【７】</w:t>
       </w:r>
       <w:r>
         <w:rPr>
@@ -1577,8 +1658,9 @@
     </w:p>
     <w:p>
       <w:pPr>
-        <w:spacing w:before="0" w:after="0"/>
+        <w:spacing w:before="0" w:after="0" w:line="360" w:lineRule="exact"/>
         <w:ind w:left="0" w:firstLine="0"/>
+        <w:jc w:val="both"/>
       </w:pPr>
       <w:r>
         <w:rPr>
@@ -1593,8 +1675,9 @@
     </w:p>
     <w:p>
       <w:pPr>
-        <w:spacing w:before="0" w:after="0"/>
+        <w:spacing w:before="0" w:after="0" w:line="360" w:lineRule="exact"/>
         <w:ind w:left="0" w:firstLine="0"/>
+        <w:jc w:val="both"/>
       </w:pPr>
       <w:r>
         <w:rPr>
@@ -1609,8 +1692,9 @@
     </w:p>
     <w:p>
       <w:pPr>
-        <w:spacing w:before="0" w:after="0"/>
+        <w:spacing w:before="0" w:after="0" w:line="360" w:lineRule="exact"/>
         <w:ind w:left="0" w:firstLine="0"/>
+        <w:jc w:val="both"/>
       </w:pPr>
       <w:r>
         <w:rPr>
@@ -1625,8 +1709,9 @@
     </w:p>
     <w:p>
       <w:pPr>
-        <w:spacing w:before="0" w:after="0"/>
+        <w:spacing w:before="0" w:after="0" w:line="360" w:lineRule="exact"/>
         <w:ind w:left="0" w:firstLine="0"/>
+        <w:jc w:val="both"/>
       </w:pPr>
       <w:r>
         <w:rPr>
@@ -1641,8 +1726,9 @@
     </w:p>
     <w:p>
       <w:pPr>
-        <w:spacing w:before="0" w:after="0"/>
+        <w:spacing w:before="0" w:after="0" w:line="360" w:lineRule="exact"/>
         <w:ind w:left="0" w:firstLine="0"/>
+        <w:jc w:val="both"/>
       </w:pPr>
       <w:r>
         <w:rPr>
@@ -1669,7 +1755,7 @@
           <w:sz w:val="21"/>
           <w:u w:val="none"/>
         </w:rPr>
-        <w:t>(1) What did the research team discover?</w:t>
+        <w:t xml:space="preserve">(1) What did the research team discover?　　　　</w:t>
       </w:r>
       <w:r>
         <w:rPr>
@@ -1678,8 +1764,9 @@
           <w:i w:val="0"/>
           <w:sz w:val="21"/>
           <w:u w:val="none"/>
+          <w:highlight w:val="yellow"/>
         </w:rPr>
-        <w:t xml:space="preserve">　　　　2</w:t>
+        <w:t>2</w:t>
       </w:r>
     </w:p>
     <w:p>
@@ -1760,7 +1847,7 @@
           <w:sz w:val="21"/>
           <w:u w:val="none"/>
         </w:rPr>
-        <w:t>(2) How are East Asian emoticons different from Western ones?</w:t>
+        <w:t xml:space="preserve">(2) How are East Asian emoticons different from Western ones?　　　　</w:t>
       </w:r>
       <w:r>
         <w:rPr>
@@ -1769,8 +1856,9 @@
           <w:i w:val="0"/>
           <w:sz w:val="21"/>
           <w:u w:val="none"/>
+          <w:highlight w:val="yellow"/>
         </w:rPr>
-        <w:t xml:space="preserve">　　　　2</w:t>
+        <w:t>2</w:t>
       </w:r>
     </w:p>
     <w:p>
@@ -1851,7 +1939,7 @@
           <w:sz w:val="21"/>
           <w:u w:val="none"/>
         </w:rPr>
-        <w:t>(3) How do people develop different patterns for reading emotions?</w:t>
+        <w:t xml:space="preserve">(3) How do people develop different patterns for reading emotions?　　　　</w:t>
       </w:r>
       <w:r>
         <w:rPr>
@@ -1860,8 +1948,9 @@
           <w:i w:val="0"/>
           <w:sz w:val="21"/>
           <w:u w:val="none"/>
+          <w:highlight w:val="yellow"/>
         </w:rPr>
-        <w:t xml:space="preserve">　　　　3</w:t>
+        <w:t>3</w:t>
       </w:r>
     </w:p>
     <w:p>
@@ -1942,7 +2031,7 @@
           <w:sz w:val="21"/>
           <w:u w:val="none"/>
         </w:rPr>
-        <w:t>(4) What does the writer suggest is important in today's world?</w:t>
+        <w:t xml:space="preserve">(4) What does the writer suggest is important in today's world?　　　　</w:t>
       </w:r>
       <w:r>
         <w:rPr>
@@ -1951,8 +2040,9 @@
           <w:i w:val="0"/>
           <w:sz w:val="21"/>
           <w:u w:val="none"/>
+          <w:highlight w:val="yellow"/>
         </w:rPr>
-        <w:t xml:space="preserve">　　　　2</w:t>
+        <w:t>2</w:t>
       </w:r>
     </w:p>
     <w:p>
@@ -2033,7 +2123,7 @@
           <w:sz w:val="21"/>
           <w:u w:val="none"/>
         </w:rPr>
-        <w:t>(5) Which statement best matches the main idea of the passage?</w:t>
+        <w:t xml:space="preserve">(5) Which statement best matches the main idea of the passage?　　　　</w:t>
       </w:r>
       <w:r>
         <w:rPr>
@@ -2042,8 +2132,9 @@
           <w:i w:val="0"/>
           <w:sz w:val="21"/>
           <w:u w:val="none"/>
+          <w:highlight w:val="yellow"/>
         </w:rPr>
-        <w:t xml:space="preserve">　　　　3</w:t>
+        <w:t>3</w:t>
       </w:r>
     </w:p>
     <w:p>
@@ -2124,7 +2215,7 @@
           <w:sz w:val="22"/>
           <w:u w:val="none"/>
         </w:rPr>
-        <w:t>【６】</w:t>
+        <w:t>【８】</w:t>
       </w:r>
       <w:r>
         <w:rPr>
@@ -2151,6 +2242,7 @@
       <w:pPr>
         <w:spacing w:before="80" w:after="0"/>
         <w:ind w:left="170" w:firstLine="0"/>
+        <w:jc w:val="both"/>
       </w:pPr>
       <w:r>
         <w:rPr>
@@ -2165,18 +2257,30 @@
       <w:r>
         <w:rPr>
           <w:rFonts w:eastAsia="MS Mincho" w:ascii="Times New Roman" w:hAnsi="Times New Roman"/>
+          <w:b w:val="0"/>
+          <w:i w:val="0"/>
+          <w:sz w:val="21"/>
+          <w:u w:val="none"/>
+        </w:rPr>
+        <w:tab/>
+      </w:r>
+      <w:r>
+        <w:rPr>
+          <w:rFonts w:eastAsia="MS Mincho" w:ascii="Times New Roman" w:hAnsi="Times New Roman"/>
           <w:b/>
           <w:i w:val="0"/>
           <w:sz w:val="21"/>
           <w:u w:val="none"/>
+          <w:highlight w:val="yellow"/>
         </w:rPr>
-        <w:t xml:space="preserve">　　at / without</w:t>
+        <w:t>at / without</w:t>
       </w:r>
     </w:p>
     <w:p>
       <w:pPr>
         <w:spacing w:before="0" w:after="40"/>
         <w:ind w:left="454" w:firstLine="0"/>
+        <w:jc w:val="left"/>
       </w:pPr>
       <w:r>
         <w:rPr>
@@ -2193,6 +2297,7 @@
       <w:pPr>
         <w:spacing w:before="80" w:after="0"/>
         <w:ind w:left="170" w:firstLine="0"/>
+        <w:jc w:val="both"/>
       </w:pPr>
       <w:r>
         <w:rPr>
@@ -2207,18 +2312,30 @@
       <w:r>
         <w:rPr>
           <w:rFonts w:eastAsia="MS Mincho" w:ascii="Times New Roman" w:hAnsi="Times New Roman"/>
+          <w:b w:val="0"/>
+          <w:i w:val="0"/>
+          <w:sz w:val="21"/>
+          <w:u w:val="none"/>
+        </w:rPr>
+        <w:tab/>
+      </w:r>
+      <w:r>
+        <w:rPr>
+          <w:rFonts w:eastAsia="MS Mincho" w:ascii="Times New Roman" w:hAnsi="Times New Roman"/>
           <w:b/>
           <w:i w:val="0"/>
           <w:sz w:val="21"/>
           <w:u w:val="none"/>
+          <w:highlight w:val="yellow"/>
         </w:rPr>
-        <w:t xml:space="preserve">　　getting / diabetes</w:t>
+        <w:t>getting / diabetes</w:t>
       </w:r>
     </w:p>
     <w:p>
       <w:pPr>
         <w:spacing w:before="0" w:after="40"/>
         <w:ind w:left="454" w:firstLine="0"/>
+        <w:jc w:val="left"/>
       </w:pPr>
       <w:r>
         <w:rPr>
@@ -2235,6 +2352,7 @@
       <w:pPr>
         <w:spacing w:before="80" w:after="0"/>
         <w:ind w:left="170" w:firstLine="0"/>
+        <w:jc w:val="both"/>
       </w:pPr>
       <w:r>
         <w:rPr>
@@ -2249,18 +2367,30 @@
       <w:r>
         <w:rPr>
           <w:rFonts w:eastAsia="MS Mincho" w:ascii="Times New Roman" w:hAnsi="Times New Roman"/>
+          <w:b w:val="0"/>
+          <w:i w:val="0"/>
+          <w:sz w:val="21"/>
+          <w:u w:val="none"/>
+        </w:rPr>
+        <w:tab/>
+      </w:r>
+      <w:r>
+        <w:rPr>
+          <w:rFonts w:eastAsia="MS Mincho" w:ascii="Times New Roman" w:hAnsi="Times New Roman"/>
           <w:b/>
           <w:i w:val="0"/>
           <w:sz w:val="21"/>
           <w:u w:val="none"/>
+          <w:highlight w:val="yellow"/>
         </w:rPr>
-        <w:t xml:space="preserve">　　go / than</w:t>
+        <w:t>go / than</w:t>
       </w:r>
     </w:p>
     <w:p>
       <w:pPr>
         <w:spacing w:before="0" w:after="40"/>
         <w:ind w:left="454" w:firstLine="0"/>
+        <w:jc w:val="left"/>
       </w:pPr>
       <w:r>
         <w:rPr>
@@ -2277,6 +2407,7 @@
       <w:pPr>
         <w:spacing w:before="80" w:after="0"/>
         <w:ind w:left="170" w:firstLine="0"/>
+        <w:jc w:val="both"/>
       </w:pPr>
       <w:r>
         <w:rPr>
@@ -2291,18 +2422,30 @@
       <w:r>
         <w:rPr>
           <w:rFonts w:eastAsia="MS Mincho" w:ascii="Times New Roman" w:hAnsi="Times New Roman"/>
+          <w:b w:val="0"/>
+          <w:i w:val="0"/>
+          <w:sz w:val="21"/>
+          <w:u w:val="none"/>
+        </w:rPr>
+        <w:tab/>
+      </w:r>
+      <w:r>
+        <w:rPr>
+          <w:rFonts w:eastAsia="MS Mincho" w:ascii="Times New Roman" w:hAnsi="Times New Roman"/>
           <w:b/>
           <w:i w:val="0"/>
           <w:sz w:val="21"/>
           <w:u w:val="none"/>
+          <w:highlight w:val="yellow"/>
         </w:rPr>
-        <w:t xml:space="preserve">　　as / build</w:t>
+        <w:t>as / build</w:t>
       </w:r>
     </w:p>
     <w:p>
       <w:pPr>
         <w:spacing w:before="0" w:after="40"/>
         <w:ind w:left="454" w:firstLine="0"/>
+        <w:jc w:val="left"/>
       </w:pPr>
       <w:r>
         <w:rPr>
@@ -2319,6 +2462,7 @@
       <w:pPr>
         <w:spacing w:before="80" w:after="0"/>
         <w:ind w:left="170" w:firstLine="0"/>
+        <w:jc w:val="both"/>
       </w:pPr>
       <w:r>
         <w:rPr>
@@ -2333,18 +2477,30 @@
       <w:r>
         <w:rPr>
           <w:rFonts w:eastAsia="MS Mincho" w:ascii="Times New Roman" w:hAnsi="Times New Roman"/>
+          <w:b w:val="0"/>
+          <w:i w:val="0"/>
+          <w:sz w:val="21"/>
+          <w:u w:val="none"/>
+        </w:rPr>
+        <w:tab/>
+      </w:r>
+      <w:r>
+        <w:rPr>
+          <w:rFonts w:eastAsia="MS Mincho" w:ascii="Times New Roman" w:hAnsi="Times New Roman"/>
           <w:b/>
           <w:i w:val="0"/>
           <w:sz w:val="21"/>
           <w:u w:val="none"/>
+          <w:highlight w:val="yellow"/>
         </w:rPr>
-        <w:t xml:space="preserve">　　planners / transportation</w:t>
+        <w:t>planners / transportation</w:t>
       </w:r>
     </w:p>
     <w:p>
       <w:pPr>
         <w:spacing w:before="0" w:after="40"/>
         <w:ind w:left="454" w:firstLine="0"/>
+        <w:jc w:val="left"/>
       </w:pPr>
       <w:r>
         <w:rPr>

</xml_diff>